<commit_message>
fix(yunhe): Day0 supported in day parser (D(?:ay)?\d+), guide promoted to top (order -1)
</commit_message>
<xml_diff>
--- a/trip/yunhe/yunhe.docx
+++ b/trip/yunhe/yunhe.docx
@@ -97,6 +97,47 @@
       </w:r>
     </w:p>
     <w:p/>
+    <w:p>
+      <w:pPr>
+        <w:pStyle w:val="Heading3"/>
+        <w:spacing w:after="80" w:lineRule="auto" w:line="300"/>
+      </w:pPr>
+      <w:r>
+        <w:rPr>
+          <w:rFonts w:ascii="Helvetica Neue" w:hAnsi="Helvetica Neue" w:eastAsia="PingFang SC"/>
+          <w:b/>
+          <w:sz w:val="24"/>
+        </w:rPr>
+        <w:t>Day0（10月xx日 周五）出发</w:t>
+      </w:r>
+    </w:p>
+    <w:p>
+      <w:pPr>
+        <w:spacing w:after="80" w:lineRule="auto" w:line="300"/>
+      </w:pPr>
+      <w:r>
+        <w:rPr>
+          <w:rFonts w:ascii="Helvetica Neue" w:hAnsi="Helvetica Neue" w:eastAsia="PingFang SC"/>
+          <w:b w:val="0"/>
+          <w:color w:val="555555"/>
+          <w:sz w:val="20"/>
+        </w:rPr>
+        <w:t>杭州(18:00) - 云和(22:00)</w:t>
+      </w:r>
+    </w:p>
+    <w:p>
+      <w:pPr>
+        <w:spacing w:after="120" w:lineRule="auto" w:line="300"/>
+      </w:pPr>
+      <w:r>
+        <w:rPr>
+          <w:rFonts w:ascii="Helvetica Neue" w:hAnsi="Helvetica Neue" w:eastAsia="PingFang SC"/>
+          <w:b w:val="0"/>
+          <w:sz w:val="21"/>
+        </w:rPr>
+        <w:t>18:00 出发，至少4小时车程；晚上抵达，不安排游玩。</w:t>
+      </w:r>
+    </w:p>
     <w:p>
       <w:pPr>
         <w:pStyle w:val="Heading3"/>

</xml_diff>

<commit_message>
update(yunhe): sync latest itinerary — Shexiang Style Street D1, terrace ticketing zones, field-tested notes
</commit_message>
<xml_diff>
--- a/trip/yunhe/yunhe.docx
+++ b/trip/yunhe/yunhe.docx
@@ -162,7 +162,7 @@
           <w:b/>
           <w:sz w:val="21"/>
         </w:rPr>
-        <w:t>景点：畲乡之窗(4小时)</w:t>
+        <w:t>景点：畲乡之窗(4小时) - 畲乡风情街(1.5小时)</w:t>
       </w:r>
     </w:p>
     <w:p>
@@ -177,7 +177,7 @@
           <w:b w:val="0"/>
           <w:sz w:val="21"/>
         </w:rPr>
-        <w:t>☐ 畲乡之窗</w:t>
+        <w:t>☑ 畲乡之窗</w:t>
       </w:r>
     </w:p>
     <w:p>
@@ -190,7 +190,7 @@
           <w:b w:val="0"/>
           <w:sz w:val="21"/>
         </w:rPr>
-        <w:t>开车1小时左右抵达畲乡之窗，午饭在古街。婚嫁表演需要订票，14:30-15:20场。16:30出发回云和县城。</w:t>
+        <w:t>开车1小时左右抵达畲乡之窗，午饭在古街。婚嫁表演需要订票，14:30-15:20场。16:30出发回云和县城。晚饭后开车到景宁县城畲乡风情街，19:00有公主巡游表演（每周六、周日晚），看完巡游再回云和。</w:t>
       </w:r>
     </w:p>
     <w:p>
@@ -232,7 +232,7 @@
           <w:b w:val="0"/>
           <w:sz w:val="21"/>
         </w:rPr>
-        <w:t>☐ 云和梯田</w:t>
+        <w:t>☑ 云和梯田</w:t>
       </w:r>
     </w:p>
     <w:p>
@@ -245,7 +245,7 @@
           <w:b w:val="0"/>
           <w:sz w:val="21"/>
         </w:rPr>
-        <w:t>自驾上梯田。车开进去，先玩九曲云环，观景台+田埂栈道。然后继续开车到白银谷和坑根石寨。17:00下山回云和县城。</w:t>
+        <w:t>自驾上梯田。车开进去，玩九曲云环，观景台+田埂栈道。17:00下山回云和县城。</w:t>
       </w:r>
     </w:p>
     <w:p>
@@ -299,7 +299,7 @@
           <w:b w:val="0"/>
           <w:sz w:val="21"/>
         </w:rPr>
-        <w:t>退房后，开车直上七星墩，观景台看全景。可能有农事体验，如果适合小朋友的，可以安排一下。午饭七星墩就地解决。16:00出发前往大港头，入住酒店。17:30后画乡老街免费开放，就地散步和晚餐。</w:t>
+        <w:t>退房后，开车直上七星墩，观景台看全景。可能有农事体验，如果适合小朋友的，可以安排一下。午饭七星墩就地解决。坑根石寨放弃，古道不走。16:00出发前往大港头，入住酒店。17:30后画乡老街免费开放，就地散步和晚餐。</w:t>
       </w:r>
     </w:p>
     <w:p>
@@ -461,7 +461,7 @@
           <w:b w:val="0"/>
           <w:sz w:val="21"/>
         </w:rPr>
-        <w:t>云和梯田门票2日有效，各景点限进一次</w:t>
+        <w:t>云和梯田门票2日有效，但分两个检票片区：九曲云环片区独立检票；白银谷、坑根石寨、七星墩共享同一张片区票，进片区一次有效，出来不能再进</w:t>
       </w:r>
     </w:p>
     <w:p>
@@ -506,7 +506,7 @@
           <w:b w:val="0"/>
           <w:sz w:val="21"/>
         </w:rPr>
-        <w:t>四个片区（九曲云环/七星墩/白银谷/坑根石寨）与游客中心均有停车场且免费；白银谷与坑根石寨相距100米</w:t>
+        <w:t>三个片区（九曲云环/七星墩/坑根石寨）与游客中心均有停车场且免费</w:t>
       </w:r>
     </w:p>
     <w:p>
@@ -698,6 +698,21 @@
           <w:sz w:val="21"/>
         </w:rPr>
         <w:t>☑ 畲乡之窗 (景宁畲族自治县 / 南 / 36.8km / 40min)</w:t>
+      </w:r>
+    </w:p>
+    <w:p>
+      <w:pPr>
+        <w:pStyle w:val="ListBullet"/>
+        <w:spacing w:after="60"/>
+        <w:ind w:left="340"/>
+      </w:pPr>
+      <w:r>
+        <w:rPr>
+          <w:rFonts w:ascii="Helvetica Neue" w:hAnsi="Helvetica Neue" w:eastAsia="PingFang SC"/>
+          <w:b w:val="0"/>
+          <w:sz w:val="21"/>
+        </w:rPr>
+        <w:t>☑ 畲乡风情街 (景宁畲族自治县 / 东南 / 22.3km / 27min)</w:t>
       </w:r>
     </w:p>
     <w:p>

</xml_diff>

<commit_message>
update(yunhe): D4 wording — 'ancient camphor trees', farm activities tentative (updated 2026-10-20)
</commit_message>
<xml_diff>
--- a/trip/yunhe/yunhe.docx
+++ b/trip/yunhe/yunhe.docx
@@ -368,7 +368,7 @@
           <w:b w:val="0"/>
           <w:sz w:val="21"/>
         </w:rPr>
-        <w:t>退房，江边看景。然后渡船过江到堰头村，看千年古樟群和通济堰。再渡船返回对岸，14:00前出发返杭，晚饭时间抵达。</w:t>
+        <w:t>退房，江边看景。然后渡船过江到堰头村，看古樟群和通济堰。再渡船返回对岸，14:00前出发返杭，晚饭时间抵达。</w:t>
       </w:r>
     </w:p>
     <w:p/>
@@ -551,7 +551,7 @@
           <w:b w:val="0"/>
           <w:sz w:val="21"/>
         </w:rPr>
-        <w:t>七星墩可体验割稻、打稻、舂米等农事项目</w:t>
+        <w:t>七星墩可能有割稻、打稻、舂米等农事项目体验</w:t>
       </w:r>
     </w:p>
     <w:p>

</xml_diff>